<commit_message>
Actualizar manual y guía rápida para instalación y roles del esquema 5
</commit_message>
<xml_diff>
--- a/restaurante2/Documentacion/ManualUsuario/Guia_rapida_Sabores.docx
+++ b/restaurante2/Documentacion/ManualUsuario/Guia_rapida_Sabores.docx
@@ -12,7 +12,7 @@
     </w:p>
     <w:p>
       <w:r>
-        <w:t>Atención diaria  |  26 de octubre de 2026  |  Commit 63339f6</w:t>
+        <w:t>Esquema 5  |  Edición 2  |  26 de octubre de 2026</w:t>
       </w:r>
     </w:p>
     <w:p>
@@ -20,22 +20,22 @@
         <w:pStyle w:val="Heading2"/>
       </w:pPr>
       <w:r>
-        <w:t>Atender una mesa</w:t>
+        <w:t>Entrar y atender</w:t>
       </w:r>
     </w:p>
     <w:p>
       <w:r>
-        <w:t>1. Entre con su usuario. En Mesas seleccione una Disponible.</w:t>
+        <w:t>1. Use su cuenta individual. Si la contraseña es temporal, cámbiela y vuelva a entrar.</w:t>
       </w:r>
     </w:p>
     <w:p>
       <w:r>
-        <w:t>2. Elija cliente si corresponde, producto y cantidad. El primer agregado crea el pedido; cada agregado posterior también se guarda.</w:t>
+        <w:t>2. Mesas: seleccione Disponible, cliente opcional, producto y cantidad. El primer agregado crea la cuenta y los siguientes también se guardan.</w:t>
       </w:r>
     </w:p>
     <w:p>
       <w:r>
-        <w:t>3. Para continuar, abra la mesa o use Pedidos y Continuar pedido seleccionado. Cerrar la ventana no cancela.</w:t>
+        <w:t>3. Retome una mesa ocupada o use Continuar pedido seleccionado. Cerrar la ventana no cancela.</w:t>
       </w:r>
     </w:p>
     <w:p>
@@ -43,37 +43,32 @@
         <w:pStyle w:val="Heading2"/>
       </w:pPr>
       <w:r>
-        <w:t>Cobrar y cerrar</w:t>
+        <w:t>Cobrar y dejar disponible</w:t>
       </w:r>
     </w:p>
     <w:p>
       <w:r>
-        <w:t>1. Pulse Revisar y cobrar y compare productos cantidades y total.</w:t>
+        <w:t>1. Pulse Revisar y cobrar. Compruebe productos receptor original descuento y total.</w:t>
       </w:r>
     </w:p>
     <w:p>
       <w:r>
-        <w:t>2. Revise receptor o Público general / sin identificación. SAT no valida esos datos.</w:t>
+        <w:t>2. Efectivo: registre lo recibido y revise cambio. Total Q 180.00 recibido Q 200.00 cambio Q 20.00.</w:t>
       </w:r>
     </w:p>
     <w:p>
       <w:r>
-        <w:t>3. Efectivo: registre lo recibido y revise cambio. Ejemplo: total Q 180.00 recibido Q 200.00 cambio Q 20.00. No se permiten pagos parciales o mixtos.</w:t>
+        <w:t>3. Tarjeta: declare Confirmado Rechazado o Incierto según evidencia externa. Confirmado e Incierto requieren referencia. No registre número completo PIN ni código de seguridad.</w:t>
       </w:r>
     </w:p>
     <w:p>
       <w:r>
-        <w:t>4. Tarjeta: declare Confirmado Rechazado o Incierto según evidencia externa. Confirmado e Incierto requieren referencia; nunca escriba datos completos de tarjeta PIN ni código de seguridad.</w:t>
+        <w:t>4. Marque revisión y comprobación del pago que corresponda. Confirme y consulte el comprobante.</w:t>
       </w:r>
     </w:p>
     <w:p>
       <w:r>
-        <w:t>5. Marque la revisión de datos y la comprobación del pago que corresponda. Pulse Confirmar operación. Un cobro confirmado genera comprobante y deja la mesa En limpieza.</w:t>
-      </w:r>
-    </w:p>
-    <w:p>
-      <w:r>
-        <w:t>6. Consulte el comprobante. Limpie y use Gestionar cierre de mesa y Confirmar limpieza para volver a Disponible.</w:t>
+        <w:t>5. Limpie y use Gestionar cierre de mesa y Confirmar limpieza para volver a Disponible.</w:t>
       </w:r>
     </w:p>
     <w:p>
@@ -81,7 +76,7 @@
         <w:pStyle w:val="Heading2"/>
       </w:pPr>
       <w:r>
-        <w:t>Si sucede una excepción</w:t>
+        <w:t>Resolver una excepción</w:t>
       </w:r>
     </w:p>
     <w:tbl>
@@ -101,7 +96,7 @@
         </w:trPr>
         <w:tc>
           <w:tcPr>
-            <w:tcW w:type="dxa" w:w="3024"/>
+            <w:tcW w:type="dxa" w:w="2736"/>
             <w:vAlign w:val="center"/>
             <w:tcBorders>
               <w:top w:val="single" w:sz="4" w:color="D9D9D9"/>
@@ -132,7 +127,7 @@
         </w:tc>
         <w:tc>
           <w:tcPr>
-            <w:tcW w:type="dxa" w:w="6480"/>
+            <w:tcW w:type="dxa" w:w="6768"/>
             <w:vAlign w:val="center"/>
             <w:tcBorders>
               <w:top w:val="single" w:sz="4" w:color="D9D9D9"/>
@@ -165,7 +160,255 @@
       <w:tr>
         <w:tc>
           <w:tcPr>
-            <w:tcW w:type="dxa" w:w="3024"/>
+            <w:tcW w:type="dxa" w:w="2736"/>
+            <w:vAlign w:val="center"/>
+            <w:tcBorders>
+              <w:top w:val="single" w:sz="4" w:color="D9D9D9"/>
+              <w:left w:val="single" w:sz="4" w:color="D9D9D9"/>
+              <w:bottom w:val="single" w:sz="4" w:color="D9D9D9"/>
+              <w:right w:val="single" w:sz="4" w:color="D9D9D9"/>
+            </w:tcBorders>
+            <w:tcMar>
+              <w:top w:w="90" w:type="dxa"/>
+              <w:left w:w="90" w:type="dxa"/>
+              <w:bottom w:w="90" w:type="dxa"/>
+              <w:right w:w="90" w:type="dxa"/>
+            </w:tcMar>
+          </w:tcPr>
+          <w:p>
+            <w:pPr>
+              <w:spacing w:after="60" w:line="240" w:lineRule="auto"/>
+            </w:pPr>
+            <w:r>
+              <w:rPr>
+                <w:b w:val="0"/>
+                <w:sz w:val="20"/>
+              </w:rPr>
+              <w:t>Descuento o cortesía</w:t>
+            </w:r>
+          </w:p>
+        </w:tc>
+        <w:tc>
+          <w:tcPr>
+            <w:tcW w:type="dxa" w:w="6768"/>
+            <w:vAlign w:val="center"/>
+            <w:tcBorders>
+              <w:top w:val="single" w:sz="4" w:color="D9D9D9"/>
+              <w:left w:val="single" w:sz="4" w:color="D9D9D9"/>
+              <w:bottom w:val="single" w:sz="4" w:color="D9D9D9"/>
+              <w:right w:val="single" w:sz="4" w:color="D9D9D9"/>
+            </w:tcBorders>
+            <w:tcMar>
+              <w:top w:w="90" w:type="dxa"/>
+              <w:left w:w="90" w:type="dxa"/>
+              <w:bottom w:w="90" w:type="dxa"/>
+              <w:right w:w="90" w:type="dxa"/>
+            </w:tcMar>
+          </w:tcPr>
+          <w:p>
+            <w:pPr>
+              <w:spacing w:after="60" w:line="240" w:lineRule="auto"/>
+            </w:pPr>
+            <w:r>
+              <w:rPr>
+                <w:b w:val="0"/>
+                <w:sz w:val="20"/>
+              </w:rPr>
+              <w:t>Gestionar cierre y Descuento o cortesía. Motivo y autorización puntual del gerente. Agregar productos invalida el ajuste.</w:t>
+            </w:r>
+          </w:p>
+        </w:tc>
+      </w:tr>
+      <w:tr>
+        <w:tc>
+          <w:tcPr>
+            <w:tcW w:type="dxa" w:w="2736"/>
+            <w:vAlign w:val="center"/>
+            <w:tcBorders>
+              <w:top w:val="single" w:sz="4" w:color="D9D9D9"/>
+              <w:left w:val="single" w:sz="4" w:color="D9D9D9"/>
+              <w:bottom w:val="single" w:sz="4" w:color="D9D9D9"/>
+              <w:right w:val="single" w:sz="4" w:color="D9D9D9"/>
+            </w:tcBorders>
+            <w:tcMar>
+              <w:top w:w="90" w:type="dxa"/>
+              <w:left w:w="90" w:type="dxa"/>
+              <w:bottom w:w="90" w:type="dxa"/>
+              <w:right w:w="90" w:type="dxa"/>
+            </w:tcMar>
+          </w:tcPr>
+          <w:p>
+            <w:pPr>
+              <w:spacing w:after="60" w:line="240" w:lineRule="auto"/>
+            </w:pPr>
+            <w:r>
+              <w:rPr>
+                <w:b w:val="0"/>
+                <w:sz w:val="20"/>
+              </w:rPr>
+              <w:t>Retiro sin preparación ni consumo</w:t>
+            </w:r>
+          </w:p>
+        </w:tc>
+        <w:tc>
+          <w:tcPr>
+            <w:tcW w:type="dxa" w:w="6768"/>
+            <w:vAlign w:val="center"/>
+            <w:tcBorders>
+              <w:top w:val="single" w:sz="4" w:color="D9D9D9"/>
+              <w:left w:val="single" w:sz="4" w:color="D9D9D9"/>
+              <w:bottom w:val="single" w:sz="4" w:color="D9D9D9"/>
+              <w:right w:val="single" w:sz="4" w:color="D9D9D9"/>
+            </w:tcBorders>
+            <w:tcMar>
+              <w:top w:w="90" w:type="dxa"/>
+              <w:left w:w="90" w:type="dxa"/>
+              <w:bottom w:w="90" w:type="dxa"/>
+              <w:right w:w="90" w:type="dxa"/>
+            </w:tcMar>
+          </w:tcPr>
+          <w:p>
+            <w:pPr>
+              <w:spacing w:after="60" w:line="240" w:lineRule="auto"/>
+            </w:pPr>
+            <w:r>
+              <w:rPr>
+                <w:b w:val="0"/>
+                <w:sz w:val="20"/>
+              </w:rPr>
+              <w:t>Solicitar Cancelar con declaración veraz y autorización; luego limpieza.</w:t>
+            </w:r>
+          </w:p>
+        </w:tc>
+      </w:tr>
+      <w:tr>
+        <w:tc>
+          <w:tcPr>
+            <w:tcW w:type="dxa" w:w="2736"/>
+            <w:vAlign w:val="center"/>
+            <w:tcBorders>
+              <w:top w:val="single" w:sz="4" w:color="D9D9D9"/>
+              <w:left w:val="single" w:sz="4" w:color="D9D9D9"/>
+              <w:bottom w:val="single" w:sz="4" w:color="D9D9D9"/>
+              <w:right w:val="single" w:sz="4" w:color="D9D9D9"/>
+            </w:tcBorders>
+            <w:tcMar>
+              <w:top w:w="90" w:type="dxa"/>
+              <w:left w:w="90" w:type="dxa"/>
+              <w:bottom w:w="90" w:type="dxa"/>
+              <w:right w:w="90" w:type="dxa"/>
+            </w:tcMar>
+          </w:tcPr>
+          <w:p>
+            <w:pPr>
+              <w:spacing w:after="60" w:line="240" w:lineRule="auto"/>
+            </w:pPr>
+            <w:r>
+              <w:rPr>
+                <w:b w:val="0"/>
+                <w:sz w:val="20"/>
+              </w:rPr>
+              <w:t>Consumo pendiente</w:t>
+            </w:r>
+          </w:p>
+        </w:tc>
+        <w:tc>
+          <w:tcPr>
+            <w:tcW w:type="dxa" w:w="6768"/>
+            <w:vAlign w:val="center"/>
+            <w:tcBorders>
+              <w:top w:val="single" w:sz="4" w:color="D9D9D9"/>
+              <w:left w:val="single" w:sz="4" w:color="D9D9D9"/>
+              <w:bottom w:val="single" w:sz="4" w:color="D9D9D9"/>
+              <w:right w:val="single" w:sz="4" w:color="D9D9D9"/>
+            </w:tcBorders>
+            <w:tcMar>
+              <w:top w:w="90" w:type="dxa"/>
+              <w:left w:w="90" w:type="dxa"/>
+              <w:bottom w:w="90" w:type="dxa"/>
+              <w:right w:w="90" w:type="dxa"/>
+            </w:tcMar>
+          </w:tcPr>
+          <w:p>
+            <w:pPr>
+              <w:spacing w:after="60" w:line="240" w:lineRule="auto"/>
+            </w:pPr>
+            <w:r>
+              <w:rPr>
+                <w:b w:val="0"/>
+                <w:sz w:val="20"/>
+              </w:rPr>
+              <w:t>Solicitar Incidencia; conserva saldo. Limpieza no perdona deuda.</w:t>
+            </w:r>
+          </w:p>
+        </w:tc>
+      </w:tr>
+      <w:tr>
+        <w:tc>
+          <w:tcPr>
+            <w:tcW w:type="dxa" w:w="2736"/>
+            <w:vAlign w:val="center"/>
+            <w:tcBorders>
+              <w:top w:val="single" w:sz="4" w:color="D9D9D9"/>
+              <w:left w:val="single" w:sz="4" w:color="D9D9D9"/>
+              <w:bottom w:val="single" w:sz="4" w:color="D9D9D9"/>
+              <w:right w:val="single" w:sz="4" w:color="D9D9D9"/>
+            </w:tcBorders>
+            <w:tcMar>
+              <w:top w:w="90" w:type="dxa"/>
+              <w:left w:w="90" w:type="dxa"/>
+              <w:bottom w:w="90" w:type="dxa"/>
+              <w:right w:w="90" w:type="dxa"/>
+            </w:tcMar>
+          </w:tcPr>
+          <w:p>
+            <w:pPr>
+              <w:spacing w:after="60" w:line="240" w:lineRule="auto"/>
+            </w:pPr>
+            <w:r>
+              <w:rPr>
+                <w:b w:val="0"/>
+                <w:sz w:val="20"/>
+              </w:rPr>
+              <w:t>Tarjeta incierta</w:t>
+            </w:r>
+          </w:p>
+        </w:tc>
+        <w:tc>
+          <w:tcPr>
+            <w:tcW w:type="dxa" w:w="6768"/>
+            <w:vAlign w:val="center"/>
+            <w:tcBorders>
+              <w:top w:val="single" w:sz="4" w:color="D9D9D9"/>
+              <w:left w:val="single" w:sz="4" w:color="D9D9D9"/>
+              <w:bottom w:val="single" w:sz="4" w:color="D9D9D9"/>
+              <w:right w:val="single" w:sz="4" w:color="D9D9D9"/>
+            </w:tcBorders>
+            <w:tcMar>
+              <w:top w:w="90" w:type="dxa"/>
+              <w:left w:w="90" w:type="dxa"/>
+              <w:bottom w:w="90" w:type="dxa"/>
+              <w:right w:w="90" w:type="dxa"/>
+            </w:tcMar>
+          </w:tcPr>
+          <w:p>
+            <w:pPr>
+              <w:spacing w:after="60" w:line="240" w:lineRule="auto"/>
+            </w:pPr>
+            <w:r>
+              <w:rPr>
+                <w:b w:val="0"/>
+                <w:sz w:val="20"/>
+              </w:rPr>
+              <w:t>No volver a cobrar. Solicitar Conciliar tarjeta con evidencia y autorización.</w:t>
+            </w:r>
+          </w:p>
+        </w:tc>
+      </w:tr>
+      <w:tr>
+        <w:tc>
+          <w:tcPr>
+            <w:tcW w:type="dxa" w:w="2736"/>
             <w:vAlign w:val="center"/>
             <w:tcBorders>
               <w:top w:val="single" w:sz="4" w:color="D9D9D9"/>
@@ -195,7 +438,7 @@
         </w:tc>
         <w:tc>
           <w:tcPr>
-            <w:tcW w:type="dxa" w:w="6480"/>
+            <w:tcW w:type="dxa" w:w="6768"/>
             <w:vAlign w:val="center"/>
             <w:tcBorders>
               <w:top w:val="single" w:sz="4" w:color="D9D9D9"/>
@@ -219,255 +462,7 @@
                 <w:b w:val="0"/>
                 <w:sz w:val="20"/>
               </w:rPr>
-              <w:t>Inicio y Recuperar operaciones pendientes. Recupere la misma operación antes de repetir.</w:t>
-            </w:r>
-          </w:p>
-        </w:tc>
-      </w:tr>
-      <w:tr>
-        <w:tc>
-          <w:tcPr>
-            <w:tcW w:type="dxa" w:w="3024"/>
-            <w:vAlign w:val="center"/>
-            <w:tcBorders>
-              <w:top w:val="single" w:sz="4" w:color="D9D9D9"/>
-              <w:left w:val="single" w:sz="4" w:color="D9D9D9"/>
-              <w:bottom w:val="single" w:sz="4" w:color="D9D9D9"/>
-              <w:right w:val="single" w:sz="4" w:color="D9D9D9"/>
-            </w:tcBorders>
-            <w:tcMar>
-              <w:top w:w="90" w:type="dxa"/>
-              <w:left w:w="90" w:type="dxa"/>
-              <w:bottom w:w="90" w:type="dxa"/>
-              <w:right w:w="90" w:type="dxa"/>
-            </w:tcMar>
-          </w:tcPr>
-          <w:p>
-            <w:pPr>
-              <w:spacing w:after="60" w:line="240" w:lineRule="auto"/>
-            </w:pPr>
-            <w:r>
-              <w:rPr>
-                <w:b w:val="0"/>
-                <w:sz w:val="20"/>
-              </w:rPr>
-              <w:t>Tarjeta incierta</w:t>
-            </w:r>
-          </w:p>
-        </w:tc>
-        <w:tc>
-          <w:tcPr>
-            <w:tcW w:type="dxa" w:w="6480"/>
-            <w:vAlign w:val="center"/>
-            <w:tcBorders>
-              <w:top w:val="single" w:sz="4" w:color="D9D9D9"/>
-              <w:left w:val="single" w:sz="4" w:color="D9D9D9"/>
-              <w:bottom w:val="single" w:sz="4" w:color="D9D9D9"/>
-              <w:right w:val="single" w:sz="4" w:color="D9D9D9"/>
-            </w:tcBorders>
-            <w:tcMar>
-              <w:top w:w="90" w:type="dxa"/>
-              <w:left w:w="90" w:type="dxa"/>
-              <w:bottom w:w="90" w:type="dxa"/>
-              <w:right w:w="90" w:type="dxa"/>
-            </w:tcMar>
-          </w:tcPr>
-          <w:p>
-            <w:pPr>
-              <w:spacing w:after="60" w:line="240" w:lineRule="auto"/>
-            </w:pPr>
-            <w:r>
-              <w:rPr>
-                <w:b w:val="0"/>
-                <w:sz w:val="20"/>
-              </w:rPr>
-              <w:t>No vuelva a cobrar. Administrador: Conciliar tarjeta con evidencia.</w:t>
-            </w:r>
-          </w:p>
-        </w:tc>
-      </w:tr>
-      <w:tr>
-        <w:tc>
-          <w:tcPr>
-            <w:tcW w:type="dxa" w:w="3024"/>
-            <w:vAlign w:val="center"/>
-            <w:tcBorders>
-              <w:top w:val="single" w:sz="4" w:color="D9D9D9"/>
-              <w:left w:val="single" w:sz="4" w:color="D9D9D9"/>
-              <w:bottom w:val="single" w:sz="4" w:color="D9D9D9"/>
-              <w:right w:val="single" w:sz="4" w:color="D9D9D9"/>
-            </w:tcBorders>
-            <w:tcMar>
-              <w:top w:w="90" w:type="dxa"/>
-              <w:left w:w="90" w:type="dxa"/>
-              <w:bottom w:w="90" w:type="dxa"/>
-              <w:right w:w="90" w:type="dxa"/>
-            </w:tcMar>
-          </w:tcPr>
-          <w:p>
-            <w:pPr>
-              <w:spacing w:after="60" w:line="240" w:lineRule="auto"/>
-            </w:pPr>
-            <w:r>
-              <w:rPr>
-                <w:b w:val="0"/>
-                <w:sz w:val="20"/>
-              </w:rPr>
-              <w:t>Retiro sin preparación ni consumo</w:t>
-            </w:r>
-          </w:p>
-        </w:tc>
-        <w:tc>
-          <w:tcPr>
-            <w:tcW w:type="dxa" w:w="6480"/>
-            <w:vAlign w:val="center"/>
-            <w:tcBorders>
-              <w:top w:val="single" w:sz="4" w:color="D9D9D9"/>
-              <w:left w:val="single" w:sz="4" w:color="D9D9D9"/>
-              <w:bottom w:val="single" w:sz="4" w:color="D9D9D9"/>
-              <w:right w:val="single" w:sz="4" w:color="D9D9D9"/>
-            </w:tcBorders>
-            <w:tcMar>
-              <w:top w:w="90" w:type="dxa"/>
-              <w:left w:w="90" w:type="dxa"/>
-              <w:bottom w:w="90" w:type="dxa"/>
-              <w:right w:w="90" w:type="dxa"/>
-            </w:tcMar>
-          </w:tcPr>
-          <w:p>
-            <w:pPr>
-              <w:spacing w:after="60" w:line="240" w:lineRule="auto"/>
-            </w:pPr>
-            <w:r>
-              <w:rPr>
-                <w:b w:val="0"/>
-                <w:sz w:val="20"/>
-              </w:rPr>
-              <w:t>Administrador: Cancelar con motivo y declaración; luego limpieza.</w:t>
-            </w:r>
-          </w:p>
-        </w:tc>
-      </w:tr>
-      <w:tr>
-        <w:tc>
-          <w:tcPr>
-            <w:tcW w:type="dxa" w:w="3024"/>
-            <w:vAlign w:val="center"/>
-            <w:tcBorders>
-              <w:top w:val="single" w:sz="4" w:color="D9D9D9"/>
-              <w:left w:val="single" w:sz="4" w:color="D9D9D9"/>
-              <w:bottom w:val="single" w:sz="4" w:color="D9D9D9"/>
-              <w:right w:val="single" w:sz="4" w:color="D9D9D9"/>
-            </w:tcBorders>
-            <w:tcMar>
-              <w:top w:w="90" w:type="dxa"/>
-              <w:left w:w="90" w:type="dxa"/>
-              <w:bottom w:w="90" w:type="dxa"/>
-              <w:right w:w="90" w:type="dxa"/>
-            </w:tcMar>
-          </w:tcPr>
-          <w:p>
-            <w:pPr>
-              <w:spacing w:after="60" w:line="240" w:lineRule="auto"/>
-            </w:pPr>
-            <w:r>
-              <w:rPr>
-                <w:b w:val="0"/>
-                <w:sz w:val="20"/>
-              </w:rPr>
-              <w:t>Retiro con consumo pendiente</w:t>
-            </w:r>
-          </w:p>
-        </w:tc>
-        <w:tc>
-          <w:tcPr>
-            <w:tcW w:type="dxa" w:w="6480"/>
-            <w:vAlign w:val="center"/>
-            <w:tcBorders>
-              <w:top w:val="single" w:sz="4" w:color="D9D9D9"/>
-              <w:left w:val="single" w:sz="4" w:color="D9D9D9"/>
-              <w:bottom w:val="single" w:sz="4" w:color="D9D9D9"/>
-              <w:right w:val="single" w:sz="4" w:color="D9D9D9"/>
-            </w:tcBorders>
-            <w:tcMar>
-              <w:top w:w="90" w:type="dxa"/>
-              <w:left w:w="90" w:type="dxa"/>
-              <w:bottom w:w="90" w:type="dxa"/>
-              <w:right w:w="90" w:type="dxa"/>
-            </w:tcMar>
-          </w:tcPr>
-          <w:p>
-            <w:pPr>
-              <w:spacing w:after="60" w:line="240" w:lineRule="auto"/>
-            </w:pPr>
-            <w:r>
-              <w:rPr>
-                <w:b w:val="0"/>
-                <w:sz w:val="20"/>
-              </w:rPr>
-              <w:t>Administrador: Incidencia. Conserva el saldo; luego limpieza.</w:t>
-            </w:r>
-          </w:p>
-        </w:tc>
-      </w:tr>
-      <w:tr>
-        <w:tc>
-          <w:tcPr>
-            <w:tcW w:type="dxa" w:w="3024"/>
-            <w:vAlign w:val="center"/>
-            <w:tcBorders>
-              <w:top w:val="single" w:sz="4" w:color="D9D9D9"/>
-              <w:left w:val="single" w:sz="4" w:color="D9D9D9"/>
-              <w:bottom w:val="single" w:sz="4" w:color="D9D9D9"/>
-              <w:right w:val="single" w:sz="4" w:color="D9D9D9"/>
-            </w:tcBorders>
-            <w:tcMar>
-              <w:top w:w="90" w:type="dxa"/>
-              <w:left w:w="90" w:type="dxa"/>
-              <w:bottom w:w="90" w:type="dxa"/>
-              <w:right w:w="90" w:type="dxa"/>
-            </w:tcMar>
-          </w:tcPr>
-          <w:p>
-            <w:pPr>
-              <w:spacing w:after="60" w:line="240" w:lineRule="auto"/>
-            </w:pPr>
-            <w:r>
-              <w:rPr>
-                <w:b w:val="0"/>
-                <w:sz w:val="20"/>
-              </w:rPr>
-              <w:t>Mesa ocupada sin pedido</w:t>
-            </w:r>
-          </w:p>
-        </w:tc>
-        <w:tc>
-          <w:tcPr>
-            <w:tcW w:type="dxa" w:w="6480"/>
-            <w:vAlign w:val="center"/>
-            <w:tcBorders>
-              <w:top w:val="single" w:sz="4" w:color="D9D9D9"/>
-              <w:left w:val="single" w:sz="4" w:color="D9D9D9"/>
-              <w:bottom w:val="single" w:sz="4" w:color="D9D9D9"/>
-              <w:right w:val="single" w:sz="4" w:color="D9D9D9"/>
-            </w:tcBorders>
-            <w:tcMar>
-              <w:top w:w="90" w:type="dxa"/>
-              <w:left w:w="90" w:type="dxa"/>
-              <w:bottom w:w="90" w:type="dxa"/>
-              <w:right w:w="90" w:type="dxa"/>
-            </w:tcMar>
-          </w:tcPr>
-          <w:p>
-            <w:pPr>
-              <w:spacing w:after="60" w:line="240" w:lineRule="auto"/>
-            </w:pPr>
-            <w:r>
-              <w:rPr>
-                <w:b w:val="0"/>
-                <w:sz w:val="20"/>
-              </w:rPr>
-              <w:t>Administrador: comprobar y Corregir estado; luego limpieza.</w:t>
+              <w:t>Inicio y Recuperar operaciones pendientes. Recuperar la misma solicitud antes de repetir.</w:t>
             </w:r>
           </w:p>
         </w:tc>
@@ -476,7 +471,7 @@
     <w:p/>
     <w:p>
       <w:r>
-        <w:t>Comprobante interno académico sin validez tributaria. Moneda GTQ con símbolo Q. Sin conexión a SAT FEL o bancos. No hay reembolsos ni correcciones financieras posteriores; solicite al administrador conservar y revisar cualquier error.</w:t>
+        <w:t>Gerente y Administrador también venden. Solo Administrador crea usuarios y configura SQL. Las aprobaciones duran dos minutos y no cambian la sesión del mesero. Moneda GTQ con Q; comprobante académico sin validez tributaria, sin SAT FEL o bancos. Sin pagos parciales mixtos ni reembolsos.</w:t>
       </w:r>
     </w:p>
     <w:sectPr>

</xml_diff>